<commit_message>
docs: add preprocessing and section introductions
</commit_message>
<xml_diff>
--- a/docs/MedShield_Chapter_4_Results_and_Discussion.docx
+++ b/docs/MedShield_Chapter_4_Results_and_Discussion.docx
@@ -364,6 +364,18 @@
     </w:p>
     <w:p>
       <w:pPr>
+        <w:widowControl/>
+      </w:pPr>
+      <w:r>
+        <w:rPr>
+          <w:rFonts w:ascii="Arial" w:hAnsi="Arial"/>
+          <w:i w:val="0"/>
+        </w:rPr>
+        <w:t>This section presented the evidence used to evaluate the MedShield DSS before interpreting its analytical findings. It established the system and data sources, reported ingestion and quality outcomes, documented preprocessing and analytical-readiness controls, described the resulting dataset and mappings, and summarized the verification evidence used in the succeeding sections.</w:t>
+      </w:r>
+    </w:p>
+    <w:p>
+      <w:pPr>
         <w:pStyle w:val="Heading2"/>
         <w:widowControl/>
       </w:pPr>
@@ -383,7 +395,7 @@
           <w:rFonts w:ascii="Arial" w:hAnsi="Arial"/>
           <w:i w:val="0"/>
         </w:rPr>
-        <w:t>The implemented DSS used a Next.js dashboard, a TypeScript service layer, and Python analytical services. The analysis used the latest local predictive_draft revision, commit b0dd6bd dated 25 September 2026, together with the descriptive outputs generated on the same date. The evidence flow began with annual sales workbooks, applied validation and standardization, produced descriptive and model outputs, and presented the results through five decision modules: Sales Diagnostics, Product Prioritization, Area Prioritization, Forecast Modeling, and Prescriptive Planning. The North Star question concerning inventory optimization and loss reduction was therefore addressed as a governed sequence from historical evidence to human-reviewed planning scenarios.</w:t>
+        <w:t>The implemented DSS used a Next.js dashboard, a TypeScript service layer, and Python analytical services. The analysis used predictive_draft commit a8b69ce dated 25 September 2026, together with the descriptive outputs generated on the same date. The evidence flow began with annual sales workbooks, applied validation and standardization, produced descriptive and model outputs, and presented the results through five decision modules: Sales Diagnostics, Product Prioritization, Area Prioritization, Forecast Modeling, and Prescriptive Planning. The North Star question concerning inventory optimization and loss reduction was therefore addressed as a governed sequence from historical evidence to human-reviewed planning scenarios.</w:t>
       </w:r>
     </w:p>
     <w:p>
@@ -1714,7 +1726,807 @@
         <w:rPr>
           <w:rFonts w:ascii="Arial" w:hAnsi="Arial"/>
         </w:rPr>
-        <w:t>4.1.3 Descriptive Dataset Produced for Analysis</w:t>
+        <w:t>4.1.3 Data Preprocessing and Analytical Readiness</w:t>
+      </w:r>
+    </w:p>
+    <w:p>
+      <w:pPr>
+        <w:widowControl/>
+      </w:pPr>
+      <w:r>
+        <w:rPr>
+          <w:rFonts w:ascii="Arial" w:hAnsi="Arial"/>
+          <w:i w:val="0"/>
+        </w:rPr>
+        <w:t>Data preprocessing converted the accepted transactions into analysis-ready monthly records while preserving the boundary between observed values and unavailable data. Delivery dates were standardized to calendar months, exact duplicates and invalid records were excluded according to the documented quality rules, and compatible records were aggregated at the product, area, and month grain. The process did not convert unknown missing months into zero demand. A zero was retained only when the source evidence supported an observed zero for the corresponding product-region month.</w:t>
+      </w:r>
+    </w:p>
+    <w:p>
+      <w:pPr>
+        <w:widowControl/>
+      </w:pPr>
+      <w:r>
+        <w:rPr>
+          <w:rFonts w:ascii="Arial" w:hAnsi="Arial"/>
+          <w:i w:val="0"/>
+        </w:rPr>
+        <w:t>The historical study scope covered 2017 through 23 September 2026, but the validated local extract ended on 31 December 2025. The unavailable 2026 year-to-date interval therefore remained missing pending ingestion and validation. Delivered quantity was used as the fulfilled-demand measure only within one compatible canonical product and source unit; all-product quantity was retained only as a coverage statistic. Geographic records were mapped to CALABARZON, MIMAROPA, Bicol, or Other National, while unresolved product and area identities remained visible rather than being assigned without evidence. A product-region series became forecast-eligible only when it had a documented mapping, at least 24 usable monthly observations, and no unresolved gap in its evaluation window. The latest validated actual month, rather than the study cutoff date, served as the model origin.</w:t>
+      </w:r>
+    </w:p>
+    <w:p>
+      <w:pPr>
+        <w:keepNext/>
+        <w:widowControl/>
+        <w:jc w:val="center"/>
+      </w:pPr>
+      <w:r>
+        <w:rPr>
+          <w:rFonts w:ascii="Arial" w:hAnsi="Arial"/>
+          <w:b/>
+          <w:i/>
+          <w:sz w:val="19"/>
+        </w:rPr>
+        <w:t>Table 4.3 Preprocessing controls and analytical implications</w:t>
+      </w:r>
+    </w:p>
+    <w:tbl>
+      <w:tblPr>
+        <w:tblW w:type="auto" w:w="0"/>
+        <w:jc w:val="center"/>
+        <w:tblLayout w:type="fixed"/>
+        <w:tblLook w:firstColumn="1" w:firstRow="1" w:lastColumn="0" w:lastRow="0" w:noHBand="0" w:noVBand="1" w:val="04A0"/>
+        <w:tblBorders>
+          <w:top w:val="single" w:sz="4" w:color="C9D5DD"/>
+          <w:left w:val="single" w:sz="4" w:color="C9D5DD"/>
+          <w:bottom w:val="single" w:sz="4" w:color="C9D5DD"/>
+          <w:right w:val="single" w:sz="4" w:color="C9D5DD"/>
+          <w:insideH w:val="single" w:sz="4" w:color="C9D5DD"/>
+          <w:insideV w:val="single" w:sz="4" w:color="C9D5DD"/>
+        </w:tblBorders>
+      </w:tblPr>
+      <w:tblGrid>
+        <w:gridCol w:w="3312"/>
+        <w:gridCol w:w="3312"/>
+        <w:gridCol w:w="3312"/>
+      </w:tblGrid>
+      <w:tr>
+        <w:trPr>
+          <w:tblHeader w:val="true"/>
+        </w:trPr>
+        <w:tc>
+          <w:tcPr>
+            <w:tcW w:type="dxa" w:w="2088"/>
+            <w:shd w:fill="2A6F9E"/>
+            <w:tcMar>
+              <w:top w:w="70" w:type="dxa"/>
+              <w:start w:w="90" w:type="dxa"/>
+              <w:bottom w:w="70" w:type="dxa"/>
+              <w:end w:w="90" w:type="dxa"/>
+            </w:tcMar>
+            <w:vAlign w:val="center"/>
+          </w:tcPr>
+          <w:p>
+            <w:pPr>
+              <w:jc w:val="center"/>
+            </w:pPr>
+            <w:r>
+              <w:rPr>
+                <w:b/>
+                <w:color w:val="FFFFFF"/>
+                <w:sz w:val="17"/>
+              </w:rPr>
+              <w:t>Preprocessing control</w:t>
+            </w:r>
+          </w:p>
+        </w:tc>
+        <w:tc>
+          <w:tcPr>
+            <w:tcW w:type="dxa" w:w="4608"/>
+            <w:shd w:fill="2A6F9E"/>
+            <w:tcMar>
+              <w:top w:w="70" w:type="dxa"/>
+              <w:start w:w="90" w:type="dxa"/>
+              <w:bottom w:w="70" w:type="dxa"/>
+              <w:end w:w="90" w:type="dxa"/>
+            </w:tcMar>
+            <w:vAlign w:val="center"/>
+          </w:tcPr>
+          <w:p>
+            <w:pPr>
+              <w:jc w:val="center"/>
+            </w:pPr>
+            <w:r>
+              <w:rPr>
+                <w:b/>
+                <w:color w:val="FFFFFF"/>
+                <w:sz w:val="17"/>
+              </w:rPr>
+              <w:t>Result in the analytical dataset</w:t>
+            </w:r>
+          </w:p>
+        </w:tc>
+        <w:tc>
+          <w:tcPr>
+            <w:tcW w:type="dxa" w:w="3456"/>
+            <w:shd w:fill="2A6F9E"/>
+            <w:tcMar>
+              <w:top w:w="70" w:type="dxa"/>
+              <w:start w:w="90" w:type="dxa"/>
+              <w:bottom w:w="70" w:type="dxa"/>
+              <w:end w:w="90" w:type="dxa"/>
+            </w:tcMar>
+            <w:vAlign w:val="center"/>
+          </w:tcPr>
+          <w:p>
+            <w:pPr>
+              <w:jc w:val="center"/>
+            </w:pPr>
+            <w:r>
+              <w:rPr>
+                <w:b/>
+                <w:color w:val="FFFFFF"/>
+                <w:sz w:val="17"/>
+              </w:rPr>
+              <w:t>DSS implication</w:t>
+            </w:r>
+          </w:p>
+        </w:tc>
+      </w:tr>
+      <w:tr>
+        <w:trPr>
+          <w:cantSplit/>
+        </w:trPr>
+        <w:tc>
+          <w:tcPr>
+            <w:tcW w:type="dxa" w:w="2088"/>
+            <w:tcMar>
+              <w:top w:w="70" w:type="dxa"/>
+              <w:start w:w="90" w:type="dxa"/>
+              <w:bottom w:w="70" w:type="dxa"/>
+              <w:end w:w="90" w:type="dxa"/>
+            </w:tcMar>
+            <w:vAlign w:val="center"/>
+          </w:tcPr>
+          <w:p>
+            <w:pPr>
+              <w:spacing w:after="0" w:line="252" w:lineRule="auto"/>
+            </w:pPr>
+            <w:r>
+              <w:rPr>
+                <w:rFonts w:ascii="Arial" w:hAnsi="Arial"/>
+                <w:sz w:val="16"/>
+              </w:rPr>
+              <w:t>Date and record validation</w:t>
+            </w:r>
+          </w:p>
+        </w:tc>
+        <w:tc>
+          <w:tcPr>
+            <w:tcW w:type="dxa" w:w="4608"/>
+            <w:tcMar>
+              <w:top w:w="70" w:type="dxa"/>
+              <w:start w:w="90" w:type="dxa"/>
+              <w:bottom w:w="70" w:type="dxa"/>
+              <w:end w:w="90" w:type="dxa"/>
+            </w:tcMar>
+            <w:vAlign w:val="center"/>
+          </w:tcPr>
+          <w:p>
+            <w:pPr>
+              <w:spacing w:after="0" w:line="252" w:lineRule="auto"/>
+            </w:pPr>
+            <w:r>
+              <w:rPr>
+                <w:rFonts w:ascii="Arial" w:hAnsi="Arial"/>
+                <w:sz w:val="16"/>
+              </w:rPr>
+              <w:t>Invalid dates, rejected records, and exact duplicates were excluded under the documented quality rules</w:t>
+            </w:r>
+          </w:p>
+        </w:tc>
+        <w:tc>
+          <w:tcPr>
+            <w:tcW w:type="dxa" w:w="3456"/>
+            <w:tcMar>
+              <w:top w:w="70" w:type="dxa"/>
+              <w:start w:w="90" w:type="dxa"/>
+              <w:bottom w:w="70" w:type="dxa"/>
+              <w:end w:w="90" w:type="dxa"/>
+            </w:tcMar>
+            <w:vAlign w:val="center"/>
+          </w:tcPr>
+          <w:p>
+            <w:pPr>
+              <w:spacing w:after="0" w:line="252" w:lineRule="auto"/>
+            </w:pPr>
+            <w:r>
+              <w:rPr>
+                <w:rFonts w:ascii="Arial" w:hAnsi="Arial"/>
+                <w:sz w:val="16"/>
+              </w:rPr>
+              <w:t>Monthly totals were based only on accepted source evidence</w:t>
+            </w:r>
+          </w:p>
+        </w:tc>
+      </w:tr>
+      <w:tr>
+        <w:trPr>
+          <w:cantSplit/>
+        </w:trPr>
+        <w:tc>
+          <w:tcPr>
+            <w:tcW w:type="dxa" w:w="2088"/>
+            <w:tcMar>
+              <w:top w:w="70" w:type="dxa"/>
+              <w:start w:w="90" w:type="dxa"/>
+              <w:bottom w:w="70" w:type="dxa"/>
+              <w:end w:w="90" w:type="dxa"/>
+            </w:tcMar>
+            <w:vAlign w:val="center"/>
+            <w:shd w:fill="EAF3F8"/>
+          </w:tcPr>
+          <w:p>
+            <w:pPr>
+              <w:spacing w:after="0" w:line="252" w:lineRule="auto"/>
+            </w:pPr>
+            <w:r>
+              <w:rPr>
+                <w:rFonts w:ascii="Arial" w:hAnsi="Arial"/>
+                <w:sz w:val="16"/>
+              </w:rPr>
+              <w:t>Calendar completion</w:t>
+            </w:r>
+          </w:p>
+        </w:tc>
+        <w:tc>
+          <w:tcPr>
+            <w:tcW w:type="dxa" w:w="4608"/>
+            <w:tcMar>
+              <w:top w:w="70" w:type="dxa"/>
+              <w:start w:w="90" w:type="dxa"/>
+              <w:bottom w:w="70" w:type="dxa"/>
+              <w:end w:w="90" w:type="dxa"/>
+            </w:tcMar>
+            <w:vAlign w:val="center"/>
+            <w:shd w:fill="EAF3F8"/>
+          </w:tcPr>
+          <w:p>
+            <w:pPr>
+              <w:spacing w:after="0" w:line="252" w:lineRule="auto"/>
+            </w:pPr>
+            <w:r>
+              <w:rPr>
+                <w:rFonts w:ascii="Arial" w:hAnsi="Arial"/>
+                <w:sz w:val="16"/>
+              </w:rPr>
+              <w:t>Observed values, observed zeros, and unknown missing months remained distinct</w:t>
+            </w:r>
+          </w:p>
+        </w:tc>
+        <w:tc>
+          <w:tcPr>
+            <w:tcW w:type="dxa" w:w="3456"/>
+            <w:tcMar>
+              <w:top w:w="70" w:type="dxa"/>
+              <w:start w:w="90" w:type="dxa"/>
+              <w:bottom w:w="70" w:type="dxa"/>
+              <w:end w:w="90" w:type="dxa"/>
+            </w:tcMar>
+            <w:vAlign w:val="center"/>
+            <w:shd w:fill="EAF3F8"/>
+          </w:tcPr>
+          <w:p>
+            <w:pPr>
+              <w:spacing w:after="0" w:line="252" w:lineRule="auto"/>
+            </w:pPr>
+            <w:r>
+              <w:rPr>
+                <w:rFonts w:ascii="Arial" w:hAnsi="Arial"/>
+                <w:sz w:val="16"/>
+              </w:rPr>
+              <w:t>Unknown periods were not fabricated as zero demand</w:t>
+            </w:r>
+          </w:p>
+        </w:tc>
+      </w:tr>
+      <w:tr>
+        <w:trPr>
+          <w:cantSplit/>
+        </w:trPr>
+        <w:tc>
+          <w:tcPr>
+            <w:tcW w:type="dxa" w:w="2088"/>
+            <w:tcMar>
+              <w:top w:w="70" w:type="dxa"/>
+              <w:start w:w="90" w:type="dxa"/>
+              <w:bottom w:w="70" w:type="dxa"/>
+              <w:end w:w="90" w:type="dxa"/>
+            </w:tcMar>
+            <w:vAlign w:val="center"/>
+          </w:tcPr>
+          <w:p>
+            <w:pPr>
+              <w:spacing w:after="0" w:line="252" w:lineRule="auto"/>
+            </w:pPr>
+            <w:r>
+              <w:rPr>
+                <w:rFonts w:ascii="Arial" w:hAnsi="Arial"/>
+                <w:sz w:val="16"/>
+              </w:rPr>
+              <w:t>2026 year-to-date treatment</w:t>
+            </w:r>
+          </w:p>
+        </w:tc>
+        <w:tc>
+          <w:tcPr>
+            <w:tcW w:type="dxa" w:w="4608"/>
+            <w:tcMar>
+              <w:top w:w="70" w:type="dxa"/>
+              <w:start w:w="90" w:type="dxa"/>
+              <w:bottom w:w="70" w:type="dxa"/>
+              <w:end w:w="90" w:type="dxa"/>
+            </w:tcMar>
+            <w:vAlign w:val="center"/>
+          </w:tcPr>
+          <w:p>
+            <w:pPr>
+              <w:spacing w:after="0" w:line="252" w:lineRule="auto"/>
+            </w:pPr>
+            <w:r>
+              <w:rPr>
+                <w:rFonts w:ascii="Arial" w:hAnsi="Arial"/>
+                <w:sz w:val="16"/>
+              </w:rPr>
+              <w:t>No validated 2026 transactions were present; the interval remained unavailable</w:t>
+            </w:r>
+          </w:p>
+        </w:tc>
+        <w:tc>
+          <w:tcPr>
+            <w:tcW w:type="dxa" w:w="3456"/>
+            <w:tcMar>
+              <w:top w:w="70" w:type="dxa"/>
+              <w:start w:w="90" w:type="dxa"/>
+              <w:bottom w:w="70" w:type="dxa"/>
+              <w:end w:w="90" w:type="dxa"/>
+            </w:tcMar>
+            <w:vAlign w:val="center"/>
+          </w:tcPr>
+          <w:p>
+            <w:pPr>
+              <w:spacing w:after="0" w:line="252" w:lineRule="auto"/>
+            </w:pPr>
+            <w:r>
+              <w:rPr>
+                <w:rFonts w:ascii="Arial" w:hAnsi="Arial"/>
+                <w:sz w:val="16"/>
+              </w:rPr>
+              <w:t>Partial-year scope was disclosed without creating a zero-valued 2026 series</w:t>
+            </w:r>
+          </w:p>
+        </w:tc>
+      </w:tr>
+      <w:tr>
+        <w:trPr>
+          <w:cantSplit/>
+        </w:trPr>
+        <w:tc>
+          <w:tcPr>
+            <w:tcW w:type="dxa" w:w="2088"/>
+            <w:tcMar>
+              <w:top w:w="70" w:type="dxa"/>
+              <w:start w:w="90" w:type="dxa"/>
+              <w:bottom w:w="70" w:type="dxa"/>
+              <w:end w:w="90" w:type="dxa"/>
+            </w:tcMar>
+            <w:vAlign w:val="center"/>
+            <w:shd w:fill="EAF3F8"/>
+          </w:tcPr>
+          <w:p>
+            <w:pPr>
+              <w:spacing w:after="0" w:line="252" w:lineRule="auto"/>
+            </w:pPr>
+            <w:r>
+              <w:rPr>
+                <w:rFonts w:ascii="Arial" w:hAnsi="Arial"/>
+                <w:sz w:val="16"/>
+              </w:rPr>
+              <w:t>Monthly aggregation</w:t>
+            </w:r>
+          </w:p>
+        </w:tc>
+        <w:tc>
+          <w:tcPr>
+            <w:tcW w:type="dxa" w:w="4608"/>
+            <w:tcMar>
+              <w:top w:w="70" w:type="dxa"/>
+              <w:start w:w="90" w:type="dxa"/>
+              <w:bottom w:w="70" w:type="dxa"/>
+              <w:end w:w="90" w:type="dxa"/>
+            </w:tcMar>
+            <w:vAlign w:val="center"/>
+            <w:shd w:fill="EAF3F8"/>
+          </w:tcPr>
+          <w:p>
+            <w:pPr>
+              <w:spacing w:after="0" w:line="252" w:lineRule="auto"/>
+            </w:pPr>
+            <w:r>
+              <w:rPr>
+                <w:rFonts w:ascii="Arial" w:hAnsi="Arial"/>
+                <w:sz w:val="16"/>
+              </w:rPr>
+              <w:t>Accepted records were grouped by compatible product, area, and calendar month</w:t>
+            </w:r>
+          </w:p>
+        </w:tc>
+        <w:tc>
+          <w:tcPr>
+            <w:tcW w:type="dxa" w:w="3456"/>
+            <w:tcMar>
+              <w:top w:w="70" w:type="dxa"/>
+              <w:start w:w="90" w:type="dxa"/>
+              <w:bottom w:w="70" w:type="dxa"/>
+              <w:end w:w="90" w:type="dxa"/>
+            </w:tcMar>
+            <w:vAlign w:val="center"/>
+            <w:shd w:fill="EAF3F8"/>
+          </w:tcPr>
+          <w:p>
+            <w:pPr>
+              <w:spacing w:after="0" w:line="252" w:lineRule="auto"/>
+            </w:pPr>
+            <w:r>
+              <w:rPr>
+                <w:rFonts w:ascii="Arial" w:hAnsi="Arial"/>
+                <w:sz w:val="16"/>
+              </w:rPr>
+              <w:t>Descriptive and predictive modules used a consistent analytical grain</w:t>
+            </w:r>
+          </w:p>
+        </w:tc>
+      </w:tr>
+      <w:tr>
+        <w:trPr>
+          <w:cantSplit/>
+        </w:trPr>
+        <w:tc>
+          <w:tcPr>
+            <w:tcW w:type="dxa" w:w="2088"/>
+            <w:tcMar>
+              <w:top w:w="70" w:type="dxa"/>
+              <w:start w:w="90" w:type="dxa"/>
+              <w:bottom w:w="70" w:type="dxa"/>
+              <w:end w:w="90" w:type="dxa"/>
+            </w:tcMar>
+            <w:vAlign w:val="center"/>
+          </w:tcPr>
+          <w:p>
+            <w:pPr>
+              <w:spacing w:after="0" w:line="252" w:lineRule="auto"/>
+            </w:pPr>
+            <w:r>
+              <w:rPr>
+                <w:rFonts w:ascii="Arial" w:hAnsi="Arial"/>
+                <w:sz w:val="16"/>
+              </w:rPr>
+              <w:t>Product and unit control</w:t>
+            </w:r>
+          </w:p>
+        </w:tc>
+        <w:tc>
+          <w:tcPr>
+            <w:tcW w:type="dxa" w:w="4608"/>
+            <w:tcMar>
+              <w:top w:w="70" w:type="dxa"/>
+              <w:start w:w="90" w:type="dxa"/>
+              <w:bottom w:w="70" w:type="dxa"/>
+              <w:end w:w="90" w:type="dxa"/>
+            </w:tcMar>
+            <w:vAlign w:val="center"/>
+          </w:tcPr>
+          <w:p>
+            <w:pPr>
+              <w:spacing w:after="0" w:line="252" w:lineRule="auto"/>
+            </w:pPr>
+            <w:r>
+              <w:rPr>
+                <w:rFonts w:ascii="Arial" w:hAnsi="Arial"/>
+                <w:sz w:val="16"/>
+              </w:rPr>
+              <w:t>Delivered quantity was compared within one canonical product and source unit</w:t>
+            </w:r>
+          </w:p>
+        </w:tc>
+        <w:tc>
+          <w:tcPr>
+            <w:tcW w:type="dxa" w:w="3456"/>
+            <w:tcMar>
+              <w:top w:w="70" w:type="dxa"/>
+              <w:start w:w="90" w:type="dxa"/>
+              <w:bottom w:w="70" w:type="dxa"/>
+              <w:end w:w="90" w:type="dxa"/>
+            </w:tcMar>
+            <w:vAlign w:val="center"/>
+          </w:tcPr>
+          <w:p>
+            <w:pPr>
+              <w:spacing w:after="0" w:line="252" w:lineRule="auto"/>
+            </w:pPr>
+            <w:r>
+              <w:rPr>
+                <w:rFonts w:ascii="Arial" w:hAnsi="Arial"/>
+                <w:sz w:val="16"/>
+              </w:rPr>
+              <w:t>Incompatible pharmaceutical units were not summed as demand</w:t>
+            </w:r>
+          </w:p>
+        </w:tc>
+      </w:tr>
+      <w:tr>
+        <w:trPr>
+          <w:cantSplit/>
+        </w:trPr>
+        <w:tc>
+          <w:tcPr>
+            <w:tcW w:type="dxa" w:w="2088"/>
+            <w:tcMar>
+              <w:top w:w="70" w:type="dxa"/>
+              <w:start w:w="90" w:type="dxa"/>
+              <w:bottom w:w="70" w:type="dxa"/>
+              <w:end w:w="90" w:type="dxa"/>
+            </w:tcMar>
+            <w:vAlign w:val="center"/>
+            <w:shd w:fill="EAF3F8"/>
+          </w:tcPr>
+          <w:p>
+            <w:pPr>
+              <w:spacing w:after="0" w:line="252" w:lineRule="auto"/>
+            </w:pPr>
+            <w:r>
+              <w:rPr>
+                <w:rFonts w:ascii="Arial" w:hAnsi="Arial"/>
+                <w:sz w:val="16"/>
+              </w:rPr>
+              <w:t>Geographic mapping</w:t>
+            </w:r>
+          </w:p>
+        </w:tc>
+        <w:tc>
+          <w:tcPr>
+            <w:tcW w:type="dxa" w:w="4608"/>
+            <w:tcMar>
+              <w:top w:w="70" w:type="dxa"/>
+              <w:start w:w="90" w:type="dxa"/>
+              <w:bottom w:w="70" w:type="dxa"/>
+              <w:end w:w="90" w:type="dxa"/>
+            </w:tcMar>
+            <w:vAlign w:val="center"/>
+            <w:shd w:fill="EAF3F8"/>
+          </w:tcPr>
+          <w:p>
+            <w:pPr>
+              <w:spacing w:after="0" w:line="252" w:lineRule="auto"/>
+            </w:pPr>
+            <w:r>
+              <w:rPr>
+                <w:rFonts w:ascii="Arial" w:hAnsi="Arial"/>
+                <w:sz w:val="16"/>
+              </w:rPr>
+              <w:t>CALABARZON, MIMAROPA, Bicol, and Other National were separated; unresolved identities remained visible</w:t>
+            </w:r>
+          </w:p>
+        </w:tc>
+        <w:tc>
+          <w:tcPr>
+            <w:tcW w:type="dxa" w:w="3456"/>
+            <w:tcMar>
+              <w:top w:w="70" w:type="dxa"/>
+              <w:start w:w="90" w:type="dxa"/>
+              <w:bottom w:w="70" w:type="dxa"/>
+              <w:end w:w="90" w:type="dxa"/>
+            </w:tcMar>
+            <w:vAlign w:val="center"/>
+            <w:shd w:fill="EAF3F8"/>
+          </w:tcPr>
+          <w:p>
+            <w:pPr>
+              <w:spacing w:after="0" w:line="252" w:lineRule="auto"/>
+            </w:pPr>
+            <w:r>
+              <w:rPr>
+                <w:rFonts w:ascii="Arial" w:hAnsi="Arial"/>
+                <w:sz w:val="16"/>
+              </w:rPr>
+              <w:t>The three study regions remained the basis of objective evidence</w:t>
+            </w:r>
+          </w:p>
+        </w:tc>
+      </w:tr>
+      <w:tr>
+        <w:trPr>
+          <w:cantSplit/>
+        </w:trPr>
+        <w:tc>
+          <w:tcPr>
+            <w:tcW w:type="dxa" w:w="2088"/>
+            <w:tcMar>
+              <w:top w:w="70" w:type="dxa"/>
+              <w:start w:w="90" w:type="dxa"/>
+              <w:bottom w:w="70" w:type="dxa"/>
+              <w:end w:w="90" w:type="dxa"/>
+            </w:tcMar>
+            <w:vAlign w:val="center"/>
+          </w:tcPr>
+          <w:p>
+            <w:pPr>
+              <w:spacing w:after="0" w:line="252" w:lineRule="auto"/>
+            </w:pPr>
+            <w:r>
+              <w:rPr>
+                <w:rFonts w:ascii="Arial" w:hAnsi="Arial"/>
+                <w:sz w:val="16"/>
+              </w:rPr>
+              <w:t>Forecast eligibility</w:t>
+            </w:r>
+          </w:p>
+        </w:tc>
+        <w:tc>
+          <w:tcPr>
+            <w:tcW w:type="dxa" w:w="4608"/>
+            <w:tcMar>
+              <w:top w:w="70" w:type="dxa"/>
+              <w:start w:w="90" w:type="dxa"/>
+              <w:bottom w:w="70" w:type="dxa"/>
+              <w:end w:w="90" w:type="dxa"/>
+            </w:tcMar>
+            <w:vAlign w:val="center"/>
+          </w:tcPr>
+          <w:p>
+            <w:pPr>
+              <w:spacing w:after="0" w:line="252" w:lineRule="auto"/>
+            </w:pPr>
+            <w:r>
+              <w:rPr>
+                <w:rFonts w:ascii="Arial" w:hAnsi="Arial"/>
+                <w:sz w:val="16"/>
+              </w:rPr>
+              <w:t>At least 24 usable months, documented mappings, and a gap-free evaluation window were required</w:t>
+            </w:r>
+          </w:p>
+        </w:tc>
+        <w:tc>
+          <w:tcPr>
+            <w:tcW w:type="dxa" w:w="3456"/>
+            <w:tcMar>
+              <w:top w:w="70" w:type="dxa"/>
+              <w:start w:w="90" w:type="dxa"/>
+              <w:bottom w:w="70" w:type="dxa"/>
+              <w:end w:w="90" w:type="dxa"/>
+            </w:tcMar>
+            <w:vAlign w:val="center"/>
+          </w:tcPr>
+          <w:p>
+            <w:pPr>
+              <w:spacing w:after="0" w:line="252" w:lineRule="auto"/>
+            </w:pPr>
+            <w:r>
+              <w:rPr>
+                <w:rFonts w:ascii="Arial" w:hAnsi="Arial"/>
+                <w:sz w:val="16"/>
+              </w:rPr>
+              <w:t>Ineligible series displayed an insufficient-history state instead of a fabricated forecast</w:t>
+            </w:r>
+          </w:p>
+        </w:tc>
+      </w:tr>
+      <w:tr>
+        <w:trPr>
+          <w:cantSplit/>
+        </w:trPr>
+        <w:tc>
+          <w:tcPr>
+            <w:tcW w:type="dxa" w:w="2088"/>
+            <w:tcMar>
+              <w:top w:w="70" w:type="dxa"/>
+              <w:start w:w="90" w:type="dxa"/>
+              <w:bottom w:w="70" w:type="dxa"/>
+              <w:end w:w="90" w:type="dxa"/>
+            </w:tcMar>
+            <w:vAlign w:val="center"/>
+            <w:shd w:fill="EAF3F8"/>
+          </w:tcPr>
+          <w:p>
+            <w:pPr>
+              <w:spacing w:after="0" w:line="252" w:lineRule="auto"/>
+            </w:pPr>
+            <w:r>
+              <w:rPr>
+                <w:rFonts w:ascii="Arial" w:hAnsi="Arial"/>
+                <w:sz w:val="16"/>
+              </w:rPr>
+              <w:t>Model origin</w:t>
+            </w:r>
+          </w:p>
+        </w:tc>
+        <w:tc>
+          <w:tcPr>
+            <w:tcW w:type="dxa" w:w="4608"/>
+            <w:tcMar>
+              <w:top w:w="70" w:type="dxa"/>
+              <w:start w:w="90" w:type="dxa"/>
+              <w:bottom w:w="70" w:type="dxa"/>
+              <w:end w:w="90" w:type="dxa"/>
+            </w:tcMar>
+            <w:vAlign w:val="center"/>
+            <w:shd w:fill="EAF3F8"/>
+          </w:tcPr>
+          <w:p>
+            <w:pPr>
+              <w:spacing w:after="0" w:line="252" w:lineRule="auto"/>
+            </w:pPr>
+            <w:r>
+              <w:rPr>
+                <w:rFonts w:ascii="Arial" w:hAnsi="Arial"/>
+                <w:sz w:val="16"/>
+              </w:rPr>
+              <w:t>The latest validated actual month anchored each forecast run</w:t>
+            </w:r>
+          </w:p>
+        </w:tc>
+        <w:tc>
+          <w:tcPr>
+            <w:tcW w:type="dxa" w:w="3456"/>
+            <w:tcMar>
+              <w:top w:w="70" w:type="dxa"/>
+              <w:start w:w="90" w:type="dxa"/>
+              <w:bottom w:w="70" w:type="dxa"/>
+              <w:end w:w="90" w:type="dxa"/>
+            </w:tcMar>
+            <w:vAlign w:val="center"/>
+            <w:shd w:fill="EAF3F8"/>
+          </w:tcPr>
+          <w:p>
+            <w:pPr>
+              <w:spacing w:after="0" w:line="252" w:lineRule="auto"/>
+            </w:pPr>
+            <w:r>
+              <w:rPr>
+                <w:rFonts w:ascii="Arial" w:hAnsi="Arial"/>
+                <w:sz w:val="16"/>
+              </w:rPr>
+              <w:t>The forecast window could advance with the calendar while data staleness remained visible</w:t>
+            </w:r>
+          </w:p>
+        </w:tc>
+      </w:tr>
+    </w:tbl>
+    <w:p>
+      <w:pPr>
+        <w:keepNext w:val="0"/>
+        <w:widowControl/>
+        <w:spacing w:after="140"/>
+      </w:pPr>
+      <w:r>
+        <w:rPr>
+          <w:rFonts w:ascii="Arial" w:hAnsi="Arial"/>
+          <w:i/>
+          <w:color w:val="64748B"/>
+          <w:sz w:val="16"/>
+        </w:rPr>
+        <w:t>Source note: Synthesis of the source-quality, calendar-completion, mapping, and forecast-eligibility controls used in the analytical pipeline.</w:t>
+      </w:r>
+    </w:p>
+    <w:p>
+      <w:pPr>
+        <w:pStyle w:val="Heading2"/>
+        <w:widowControl/>
+      </w:pPr>
+      <w:r>
+        <w:rPr>
+          <w:rFonts w:ascii="Arial" w:hAnsi="Arial"/>
+        </w:rPr>
+        <w:t>4.1.4 Descriptive Dataset Produced for Analysis</w:t>
       </w:r>
     </w:p>
     <w:p>
@@ -1826,7 +2638,7 @@
         <w:rPr>
           <w:rFonts w:ascii="Arial" w:hAnsi="Arial"/>
         </w:rPr>
-        <w:t>4.1.4 Geographic and Product Mapping</w:t>
+        <w:t>4.1.5 Geographic and Product Mapping</w:t>
       </w:r>
     </w:p>
     <w:p>
@@ -1862,7 +2674,7 @@
         <w:rPr>
           <w:rFonts w:ascii="Arial" w:hAnsi="Arial"/>
         </w:rPr>
-        <w:t>4.1.5 System Verification</w:t>
+        <w:t>4.1.6 System Verification</w:t>
       </w:r>
     </w:p>
     <w:p>
@@ -1890,7 +2702,7 @@
           <w:i/>
           <w:sz w:val="19"/>
         </w:rPr>
-        <w:t>Table 4.3 Interpretation of system verification</w:t>
+        <w:t>Table 4.4 Interpretation of system verification</w:t>
       </w:r>
     </w:p>
     <w:tbl>
@@ -2341,6 +3153,18 @@
     </w:p>
     <w:p>
       <w:pPr>
+        <w:widowControl/>
+      </w:pPr>
+      <w:r>
+        <w:rPr>
+          <w:rFonts w:ascii="Arial" w:hAnsi="Arial"/>
+          <w:i w:val="0"/>
+        </w:rPr>
+        <w:t>This section analyzed the validated evidence in relation to the specific objectives. It examined the operational definition of fulfilled demand, calendar completeness and forecast eligibility, long-term and seasonal patterns, product and geographic priorities, predictive-model performance, and the boundaries of the prescriptive scenarios.</w:t>
+      </w:r>
+    </w:p>
+    <w:p>
+      <w:pPr>
         <w:pStyle w:val="Heading2"/>
         <w:widowControl/>
       </w:pPr>
@@ -2388,7 +3212,7 @@
           <w:i/>
           <w:sz w:val="19"/>
         </w:rPr>
-        <w:t>Table 4.4 Predictive-readiness gates</w:t>
+        <w:t>Table 4.5 Predictive-readiness gates</w:t>
       </w:r>
     </w:p>
     <w:tbl>
@@ -3139,7 +3963,7 @@
           <w:i/>
           <w:sz w:val="19"/>
         </w:rPr>
-        <w:t>Table 4.5 Highest net-sales product labels</w:t>
+        <w:t>Table 4.6 Highest net-sales product labels</w:t>
       </w:r>
     </w:p>
     <w:tbl>
@@ -4100,7 +4924,7 @@
           <w:i/>
           <w:sz w:val="19"/>
         </w:rPr>
-        <w:t>Table 4.6 Historical aggregate model comparison</w:t>
+        <w:t>Table 4.7 Historical aggregate model comparison</w:t>
       </w:r>
     </w:p>
     <w:tbl>
@@ -4806,7 +5630,7 @@
           <w:i/>
           <w:sz w:val="19"/>
         </w:rPr>
-        <w:t>Table 4.7 Selected EOQ/ROP formula demonstrations</w:t>
+        <w:t>Table 4.8 Selected EOQ/ROP formula demonstrations</w:t>
       </w:r>
     </w:p>
     <w:tbl>
@@ -5663,6 +6487,18 @@
           <w:rFonts w:ascii="Arial" w:hAnsi="Arial"/>
           <w:i w:val="0"/>
         </w:rPr>
+        <w:t>This section described how the DSS translated the analytical results into a decision narrative for managers. It examined how the five dashboard modules guided the user from source context and historical performance to prioritization, forecast review, scenario planning, and human approval while preserving the status and limitations of each result.</w:t>
+      </w:r>
+    </w:p>
+    <w:p>
+      <w:pPr>
+        <w:widowControl/>
+      </w:pPr>
+      <w:r>
+        <w:rPr>
+          <w:rFonts w:ascii="Arial" w:hAnsi="Arial"/>
+          <w:i w:val="0"/>
+        </w:rPr>
         <w:t>The latest predictive_draft DSS presented the analytical path as a guided data story that moved from context and historical patterns to product and geographic priorities, forecast uncertainty, scenario planning, and human review. Its interface used descriptive period windows, explicit source-verification status, scenario selectors, regional-group drilldown, selectable next-3-, next-6-, and next-12-month forecast horizons, and editable planning assumptions. The first forecast period advanced to the month after the reporting month whenever the calendar changed. Monthly granularity was used for seasonality and planning timing, while yearly granularity was used for long-term comparison. Pending, actual, estimated, forecast, proxy, unavailable, and scenario values were visually separated.</w:t>
       </w:r>
     </w:p>
@@ -6143,7 +6979,7 @@
           <w:i/>
           <w:sz w:val="19"/>
         </w:rPr>
-        <w:t>Table 4.8 Data-story sequence implemented in the dashboard</w:t>
+        <w:t>Table 4.9 Data-story sequence implemented in the dashboard</w:t>
       </w:r>
     </w:p>
     <w:tbl>
@@ -6943,6 +7779,18 @@
           <w:rFonts w:ascii="Arial" w:hAnsi="Arial"/>
           <w:i w:val="0"/>
         </w:rPr>
+        <w:t>This section consolidated the principal findings from the descriptive, predictive, prescriptive, and dashboard results. It related the available evidence to the study objectives, distinguished completed DSS capabilities from remaining validation gaps, and stated the conditions under which the results could support management decisions.</w:t>
+      </w:r>
+    </w:p>
+    <w:p>
+      <w:pPr>
+        <w:widowControl/>
+      </w:pPr>
+      <w:r>
+        <w:rPr>
+          <w:rFonts w:ascii="Arial" w:hAnsi="Arial"/>
+          <w:i w:val="0"/>
+        </w:rPr>
         <w:t>The developed DSS established a functioning evidence chain from source validation to decision presentation. The descriptive layer processed multi-year sales records, preserved missing-data states, separated the study regions from Other National, performed Pareto and ABC analyses, and applied robust STL only to eligible product-region series. Historical predictive challengers did not consistently outperform the seasonal-naive benchmark, while supplemental tests confirmed that classical models were viable challenger and fallback candidates. SO3 was therefore interpreted as a governed champion–challenger portfolio in which retraining could substitute a validated model when the incumbent failed, without assuming that the most complex model would produce the best result. The prescriptive layer was substantially implemented for its intended purpose as a what-if DSS. It accepted explicit assumptions, compared operating presets, solved constrained allocation scenarios, rejected infeasible combinations, and applied the ≤5% expiry-wastage policy as a scenario guardrail. It did not execute purchases or claim an observed reduction in wastage.</w:t>
       </w:r>
     </w:p>
@@ -6971,7 +7819,7 @@
           <w:i/>
           <w:sz w:val="19"/>
         </w:rPr>
-        <w:t>Table 4.9 Consolidated findings and managerial meaning</w:t>
+        <w:t>Table 4.10 Consolidated findings and managerial meaning</w:t>
       </w:r>
     </w:p>
     <w:tbl>
@@ -7602,7 +8450,7 @@
           <w:i/>
           <w:sz w:val="19"/>
         </w:rPr>
-        <w:t>Table 4.10 Objective–evidence matrix and evidence completeness</w:t>
+        <w:t>Table 4.11 Objective–evidence matrix and evidence completeness</w:t>
       </w:r>
     </w:p>
     <w:tbl>

</xml_diff>